<commit_message>
fix(b2b): poprawki z recenzji generatora aneksów
- bramka widoczności stawek obejmuje aneks z pozycjami stawki (carries_money)
- rejestr przeliczany z najnowszego aktywnego aneksu tego typu — anulowanie
  obu aneksów wraca do stanu sprzed nich, „Popraw” starszego nie nadpisuje
  nowszego
- blokada wiersza rejestru z populate_existing
- stary aneks stawki: formularz z jego stawką, waluta zachowana przy
  poprawce i ponownym pobraniu; stary aneks daty startu zachowuje tryb daty

Co-Authored-By: Claude Opus 5.5 <noreply@anthropic.com>
</commit_message>
<xml_diff>
--- a/backend/app/templates/documents/annex_start_date_pl.docx
+++ b/backend/app/templates/documents/annex_start_date_pl.docx
@@ -306,7 +306,7 @@
           <w:b w:val="0"/>
           <w:sz w:val="18"/>
         </w:rPr>
-        <w:t>„Partner zobowiązany jest do podjęcia świadczenia usług wynikających z niniejszej Umowy z dniem {{ doc.current_start_date }} r.”</w:t>
+        <w:t>„Partner zobowiązany jest do podjęcia świadczenia usług wynikających z niniejszej Umowy {{ doc.current_start_phrase }}”</w:t>
       </w:r>
     </w:p>
     <w:p>
@@ -337,7 +337,7 @@
           <w:b w:val="0"/>
           <w:sz w:val="18"/>
         </w:rPr>
-        <w:t>„Partner zobowiązany jest do podjęcia świadczenia usług wynikających z niniejszej Umowy z dniem {{ doc.new_start_date }} r.”</w:t>
+        <w:t>„Partner zobowiązany jest do podjęcia świadczenia usług wynikających z niniejszej Umowy {{ doc.new_start_phrase }}”</w:t>
       </w:r>
     </w:p>
     <w:p>
@@ -368,7 +368,7 @@
           <w:b w:val="0"/>
           <w:sz w:val="18"/>
         </w:rPr>
-        <w:t>{{ doc.current_start_date }} r.</w:t>
+        <w:t>{{ doc.current_start_value }}</w:t>
       </w:r>
     </w:p>
     <w:p>
@@ -399,7 +399,7 @@
           <w:b w:val="0"/>
           <w:sz w:val="18"/>
         </w:rPr>
-        <w:t>{{ doc.new_start_date }} r.</w:t>
+        <w:t>{{ doc.new_start_value }}</w:t>
       </w:r>
     </w:p>
     <w:p>

</xml_diff>